<commit_message>
Update SQL docs: replace original author with Bhukya Suresh (IIT Indore, 230005010)
</commit_message>
<xml_diff>
--- a/SQL Portfolio Project.docx
+++ b/SQL Portfolio Project.docx
@@ -82,7 +82,7 @@
           <w:szCs w:val="24"/>
           <w:lang w:val="en-US"/>
         </w:rPr>
-        <w:t xml:space="preserve">by Ekaterina </w:t>
+        <w:t>by Bhukya Suresh</w:t>
       </w:r>
       <w:proofErr w:type="spellStart"/>
       <w:r>
@@ -94,9 +94,73 @@
           <w:szCs w:val="24"/>
           <w:lang w:val="en-US"/>
         </w:rPr>
-        <w:t>Khamyshkeeva</w:t>
       </w:r>
       <w:proofErr w:type="spellEnd"/>
+    </w:p>
+    <w:p>
+      <w:pPr>
+        <w:jc w:val="center"/>
+      </w:pPr>
+      <w:r>
+        <w:rPr>
+          <w:b/>
+          <w:color w:val="006400"/>
+          <w:sz w:val="22"/>
+        </w:rPr>
+        <w:t>Indian Institute of Technology Indore (IIT Indore)</w:t>
+      </w:r>
+    </w:p>
+    <w:p>
+      <w:pPr>
+        <w:jc w:val="center"/>
+      </w:pPr>
+      <w:r>
+        <w:rPr>
+          <w:b w:val="0"/>
+          <w:color w:val="404040"/>
+          <w:sz w:val="22"/>
+        </w:rPr>
+        <w:t>Student ID: 230005010</w:t>
+      </w:r>
+    </w:p>
+    <w:p>
+      <w:pPr>
+        <w:jc w:val="center"/>
+      </w:pPr>
+      <w:r>
+        <w:rPr>
+          <w:b w:val="0"/>
+          <w:color w:val="404040"/>
+          <w:sz w:val="22"/>
+        </w:rPr>
+        <w:t>Email: suryammu24@gmail.com | mems230005010@iiti.ac.in</w:t>
+      </w:r>
+    </w:p>
+    <w:p>
+      <w:pPr>
+        <w:jc w:val="center"/>
+      </w:pPr>
+      <w:r>
+        <w:rPr>
+          <w:b w:val="0"/>
+          <w:color w:val="00008B"/>
+          <w:sz w:val="22"/>
+        </w:rPr>
+        <w:t>LinkedIn: linkedin.com/in/bhukyasuresh3824</w:t>
+      </w:r>
+    </w:p>
+    <w:p>
+      <w:pPr>
+        <w:jc w:val="center"/>
+      </w:pPr>
+      <w:r>
+        <w:rPr>
+          <w:b w:val="0"/>
+          <w:color w:val="00008B"/>
+          <w:sz w:val="22"/>
+        </w:rPr>
+        <w:t>GitHub: github.com/bhukyasuresh24</w:t>
+      </w:r>
     </w:p>
     <w:p>
       <w:pPr>
@@ -914,70 +978,6 @@
         <w:rPr>
           <w:noProof/>
         </w:rPr>
-        <w:lastRenderedPageBreak/>
-        <mc:AlternateContent>
-          <mc:Choice Requires="wpg">
-            <w:drawing>
-              <wp:inline distT="0" distB="0" distL="0" distR="0" wp14:anchorId="72202B32" wp14:editId="572617BF">
-                <wp:extent cx="1502115" cy="620666"/>
-                <wp:effectExtent l="0" t="0" r="0" b="0"/>
-                <wp:docPr id="1" name="Picture 1"/>
-                <wp:cNvGraphicFramePr>
-                  <a:graphicFrameLocks xmlns:a="http://schemas.openxmlformats.org/drawingml/2006/main" noChangeAspect="1"/>
-                </wp:cNvGraphicFramePr>
-                <a:graphic xmlns:a="http://schemas.openxmlformats.org/drawingml/2006/main">
-                  <a:graphicData uri="http://schemas.openxmlformats.org/drawingml/2006/picture">
-                    <pic:pic xmlns:pic="http://schemas.openxmlformats.org/drawingml/2006/picture">
-                      <pic:nvPicPr>
-                        <pic:cNvPr id="1987410469" name=""/>
-                        <pic:cNvPicPr>
-                          <a:picLocks noChangeAspect="1"/>
-                        </pic:cNvPicPr>
-                      </pic:nvPicPr>
-                      <pic:blipFill>
-                        <a:blip r:embed="rId7"/>
-                        <a:stretch/>
-                      </pic:blipFill>
-                      <pic:spPr bwMode="auto">
-                        <a:xfrm>
-                          <a:off x="0" y="0"/>
-                          <a:ext cx="1502114" cy="620665"/>
-                        </a:xfrm>
-                        <a:prstGeom prst="rect">
-                          <a:avLst/>
-                        </a:prstGeom>
-                      </pic:spPr>
-                    </pic:pic>
-                  </a:graphicData>
-                </a:graphic>
-              </wp:inline>
-            </w:drawing>
-          </mc:Choice>
-          <mc:Fallback xmlns:a="http://schemas.openxmlformats.org/drawingml/2006/main">
-            <w:pict>
-              <v:shapetype type="#_x0000_t75" o:spt="75" coordsize="21600,21600" o:preferrelative="t" path="m@4@5l@4@11@9@11@9@5xe">
-                <v:formulas>
-                  <v:f eqn="if lineDrawn pixelLineWidth 0"/>
-                  <v:f eqn="sum @0 1 0"/>
-                  <v:f eqn="sum 0 0 @1"/>
-                  <v:f eqn="prod @2 1 2"/>
-                  <v:f eqn="prod @3 21600 pixelWidth"/>
-                  <v:f eqn="prod @3 21600 pixelHeight"/>
-                  <v:f eqn="sum @0 0 1"/>
-                  <v:f eqn="prod @6 1 2"/>
-                  <v:f eqn="prod @7 21600 pixelWidth"/>
-                  <v:f eqn="sum @8 21600 0"/>
-                  <v:f eqn="prod @7 21600 pixelHeight"/>
-                  <v:f eqn="sum @10 21600 0"/>
-                </v:formulas>
-              </v:shapetype>
-              <v:shape id="_x0000_i0" o:spid="_x0000_s0" type="#_x0000_t75" style="width:118.28pt;height:48.87pt;mso-wrap-distance-left:0.00pt;mso-wrap-distance-top:0.00pt;mso-wrap-distance-right:0.00pt;mso-wrap-distance-bottom:0.00pt;" stroked="false">
-                <v:path textboxrect="0,0,0,0"/>
-                <v:imagedata r:id="rId9" o:title=""/>
-              </v:shape>
-            </w:pict>
-          </mc:Fallback>
-        </mc:AlternateContent>
       </w:r>
     </w:p>
     <w:p/>
@@ -1051,69 +1051,6 @@
         <w:rPr>
           <w:noProof/>
         </w:rPr>
-        <mc:AlternateContent>
-          <mc:Choice Requires="wpg">
-            <w:drawing>
-              <wp:inline distT="0" distB="0" distL="0" distR="0" wp14:anchorId="6B69DA84" wp14:editId="56F0FBE1">
-                <wp:extent cx="1181805" cy="651443"/>
-                <wp:effectExtent l="0" t="0" r="0" b="0"/>
-                <wp:docPr id="2" name="Picture 2"/>
-                <wp:cNvGraphicFramePr>
-                  <a:graphicFrameLocks xmlns:a="http://schemas.openxmlformats.org/drawingml/2006/main" noChangeAspect="1"/>
-                </wp:cNvGraphicFramePr>
-                <a:graphic xmlns:a="http://schemas.openxmlformats.org/drawingml/2006/main">
-                  <a:graphicData uri="http://schemas.openxmlformats.org/drawingml/2006/picture">
-                    <pic:pic xmlns:pic="http://schemas.openxmlformats.org/drawingml/2006/picture">
-                      <pic:nvPicPr>
-                        <pic:cNvPr id="1558656710" name=""/>
-                        <pic:cNvPicPr>
-                          <a:picLocks noChangeAspect="1"/>
-                        </pic:cNvPicPr>
-                      </pic:nvPicPr>
-                      <pic:blipFill>
-                        <a:blip r:embed="rId10"/>
-                        <a:stretch/>
-                      </pic:blipFill>
-                      <pic:spPr bwMode="auto">
-                        <a:xfrm>
-                          <a:off x="0" y="0"/>
-                          <a:ext cx="1181805" cy="651443"/>
-                        </a:xfrm>
-                        <a:prstGeom prst="rect">
-                          <a:avLst/>
-                        </a:prstGeom>
-                      </pic:spPr>
-                    </pic:pic>
-                  </a:graphicData>
-                </a:graphic>
-              </wp:inline>
-            </w:drawing>
-          </mc:Choice>
-          <mc:Fallback xmlns:a="http://schemas.openxmlformats.org/drawingml/2006/main">
-            <w:pict>
-              <v:shapetype type="#_x0000_t75" o:spt="75" coordsize="21600,21600" o:preferrelative="t" path="m@4@5l@4@11@9@11@9@5xe">
-                <v:formulas>
-                  <v:f eqn="if lineDrawn pixelLineWidth 0"/>
-                  <v:f eqn="sum @0 1 0"/>
-                  <v:f eqn="sum 0 0 @1"/>
-                  <v:f eqn="prod @2 1 2"/>
-                  <v:f eqn="prod @3 21600 pixelWidth"/>
-                  <v:f eqn="prod @3 21600 pixelHeight"/>
-                  <v:f eqn="sum @0 0 1"/>
-                  <v:f eqn="prod @6 1 2"/>
-                  <v:f eqn="prod @7 21600 pixelWidth"/>
-                  <v:f eqn="sum @8 21600 0"/>
-                  <v:f eqn="prod @7 21600 pixelHeight"/>
-                  <v:f eqn="sum @10 21600 0"/>
-                </v:formulas>
-              </v:shapetype>
-              <v:shape id="_x0000_i1" o:spid="_x0000_s1" type="#_x0000_t75" style="width:93.06pt;height:51.29pt;mso-wrap-distance-left:0.00pt;mso-wrap-distance-top:0.00pt;mso-wrap-distance-right:0.00pt;mso-wrap-distance-bottom:0.00pt;" stroked="false">
-                <v:path textboxrect="0,0,0,0"/>
-                <v:imagedata r:id="rId11" o:title=""/>
-              </v:shape>
-            </w:pict>
-          </mc:Fallback>
-        </mc:AlternateContent>
       </w:r>
     </w:p>
     <w:p/>
@@ -1279,69 +1216,6 @@
         <w:rPr>
           <w:noProof/>
         </w:rPr>
-        <mc:AlternateContent>
-          <mc:Choice Requires="wpg">
-            <w:drawing>
-              <wp:inline distT="0" distB="0" distL="0" distR="0" wp14:anchorId="75FBBF60" wp14:editId="55E9C181">
-                <wp:extent cx="1159215" cy="616830"/>
-                <wp:effectExtent l="0" t="0" r="0" b="0"/>
-                <wp:docPr id="3" name="Picture 3"/>
-                <wp:cNvGraphicFramePr>
-                  <a:graphicFrameLocks xmlns:a="http://schemas.openxmlformats.org/drawingml/2006/main" noChangeAspect="1"/>
-                </wp:cNvGraphicFramePr>
-                <a:graphic xmlns:a="http://schemas.openxmlformats.org/drawingml/2006/main">
-                  <a:graphicData uri="http://schemas.openxmlformats.org/drawingml/2006/picture">
-                    <pic:pic xmlns:pic="http://schemas.openxmlformats.org/drawingml/2006/picture">
-                      <pic:nvPicPr>
-                        <pic:cNvPr id="1821523724" name=""/>
-                        <pic:cNvPicPr>
-                          <a:picLocks noChangeAspect="1"/>
-                        </pic:cNvPicPr>
-                      </pic:nvPicPr>
-                      <pic:blipFill>
-                        <a:blip r:embed="rId12"/>
-                        <a:stretch/>
-                      </pic:blipFill>
-                      <pic:spPr bwMode="auto">
-                        <a:xfrm>
-                          <a:off x="0" y="0"/>
-                          <a:ext cx="1159214" cy="616829"/>
-                        </a:xfrm>
-                        <a:prstGeom prst="rect">
-                          <a:avLst/>
-                        </a:prstGeom>
-                      </pic:spPr>
-                    </pic:pic>
-                  </a:graphicData>
-                </a:graphic>
-              </wp:inline>
-            </w:drawing>
-          </mc:Choice>
-          <mc:Fallback xmlns:a="http://schemas.openxmlformats.org/drawingml/2006/main">
-            <w:pict>
-              <v:shapetype type="#_x0000_t75" o:spt="75" coordsize="21600,21600" o:preferrelative="t" path="m@4@5l@4@11@9@11@9@5xe">
-                <v:formulas>
-                  <v:f eqn="if lineDrawn pixelLineWidth 0"/>
-                  <v:f eqn="sum @0 1 0"/>
-                  <v:f eqn="sum 0 0 @1"/>
-                  <v:f eqn="prod @2 1 2"/>
-                  <v:f eqn="prod @3 21600 pixelWidth"/>
-                  <v:f eqn="prod @3 21600 pixelHeight"/>
-                  <v:f eqn="sum @0 0 1"/>
-                  <v:f eqn="prod @6 1 2"/>
-                  <v:f eqn="prod @7 21600 pixelWidth"/>
-                  <v:f eqn="sum @8 21600 0"/>
-                  <v:f eqn="prod @7 21600 pixelHeight"/>
-                  <v:f eqn="sum @10 21600 0"/>
-                </v:formulas>
-              </v:shapetype>
-              <v:shape id="_x0000_i2" o:spid="_x0000_s2" type="#_x0000_t75" style="width:91.28pt;height:48.57pt;mso-wrap-distance-left:0.00pt;mso-wrap-distance-top:0.00pt;mso-wrap-distance-right:0.00pt;mso-wrap-distance-bottom:0.00pt;" stroked="false">
-                <v:path textboxrect="0,0,0,0"/>
-                <v:imagedata r:id="rId13" o:title=""/>
-              </v:shape>
-            </w:pict>
-          </mc:Fallback>
-        </mc:AlternateContent>
       </w:r>
     </w:p>
     <w:p>
@@ -1494,69 +1368,6 @@
         <w:rPr>
           <w:noProof/>
         </w:rPr>
-        <mc:AlternateContent>
-          <mc:Choice Requires="wpg">
-            <w:drawing>
-              <wp:inline distT="0" distB="0" distL="0" distR="0" wp14:anchorId="03B166FB" wp14:editId="47C85AFD">
-                <wp:extent cx="1159215" cy="594469"/>
-                <wp:effectExtent l="0" t="0" r="0" b="0"/>
-                <wp:docPr id="4" name="Picture 4"/>
-                <wp:cNvGraphicFramePr>
-                  <a:graphicFrameLocks xmlns:a="http://schemas.openxmlformats.org/drawingml/2006/main" noChangeAspect="1"/>
-                </wp:cNvGraphicFramePr>
-                <a:graphic xmlns:a="http://schemas.openxmlformats.org/drawingml/2006/main">
-                  <a:graphicData uri="http://schemas.openxmlformats.org/drawingml/2006/picture">
-                    <pic:pic xmlns:pic="http://schemas.openxmlformats.org/drawingml/2006/picture">
-                      <pic:nvPicPr>
-                        <pic:cNvPr id="1582085179" name=""/>
-                        <pic:cNvPicPr>
-                          <a:picLocks noChangeAspect="1"/>
-                        </pic:cNvPicPr>
-                      </pic:nvPicPr>
-                      <pic:blipFill>
-                        <a:blip r:embed="rId14"/>
-                        <a:stretch/>
-                      </pic:blipFill>
-                      <pic:spPr bwMode="auto">
-                        <a:xfrm>
-                          <a:off x="0" y="0"/>
-                          <a:ext cx="1159214" cy="594469"/>
-                        </a:xfrm>
-                        <a:prstGeom prst="rect">
-                          <a:avLst/>
-                        </a:prstGeom>
-                      </pic:spPr>
-                    </pic:pic>
-                  </a:graphicData>
-                </a:graphic>
-              </wp:inline>
-            </w:drawing>
-          </mc:Choice>
-          <mc:Fallback xmlns:a="http://schemas.openxmlformats.org/drawingml/2006/main">
-            <w:pict>
-              <v:shapetype type="#_x0000_t75" o:spt="75" coordsize="21600,21600" o:preferrelative="t" path="m@4@5l@4@11@9@11@9@5xe">
-                <v:formulas>
-                  <v:f eqn="if lineDrawn pixelLineWidth 0"/>
-                  <v:f eqn="sum @0 1 0"/>
-                  <v:f eqn="sum 0 0 @1"/>
-                  <v:f eqn="prod @2 1 2"/>
-                  <v:f eqn="prod @3 21600 pixelWidth"/>
-                  <v:f eqn="prod @3 21600 pixelHeight"/>
-                  <v:f eqn="sum @0 0 1"/>
-                  <v:f eqn="prod @6 1 2"/>
-                  <v:f eqn="prod @7 21600 pixelWidth"/>
-                  <v:f eqn="sum @8 21600 0"/>
-                  <v:f eqn="prod @7 21600 pixelHeight"/>
-                  <v:f eqn="sum @10 21600 0"/>
-                </v:formulas>
-              </v:shapetype>
-              <v:shape id="_x0000_i3" o:spid="_x0000_s3" type="#_x0000_t75" style="width:91.28pt;height:46.81pt;mso-wrap-distance-left:0.00pt;mso-wrap-distance-top:0.00pt;mso-wrap-distance-right:0.00pt;mso-wrap-distance-bottom:0.00pt;" stroked="false">
-                <v:path textboxrect="0,0,0,0"/>
-                <v:imagedata r:id="rId15" o:title=""/>
-              </v:shape>
-            </w:pict>
-          </mc:Fallback>
-        </mc:AlternateContent>
       </w:r>
     </w:p>
     <w:p>
@@ -1641,69 +1452,6 @@
         <w:rPr>
           <w:noProof/>
         </w:rPr>
-        <mc:AlternateContent>
-          <mc:Choice Requires="wpg">
-            <w:drawing>
-              <wp:inline distT="0" distB="0" distL="0" distR="0" wp14:anchorId="6C577167" wp14:editId="71A65FEC">
-                <wp:extent cx="1159215" cy="632782"/>
-                <wp:effectExtent l="0" t="0" r="0" b="0"/>
-                <wp:docPr id="5" name="Picture 5"/>
-                <wp:cNvGraphicFramePr>
-                  <a:graphicFrameLocks xmlns:a="http://schemas.openxmlformats.org/drawingml/2006/main" noChangeAspect="1"/>
-                </wp:cNvGraphicFramePr>
-                <a:graphic xmlns:a="http://schemas.openxmlformats.org/drawingml/2006/main">
-                  <a:graphicData uri="http://schemas.openxmlformats.org/drawingml/2006/picture">
-                    <pic:pic xmlns:pic="http://schemas.openxmlformats.org/drawingml/2006/picture">
-                      <pic:nvPicPr>
-                        <pic:cNvPr id="832070415" name=""/>
-                        <pic:cNvPicPr>
-                          <a:picLocks noChangeAspect="1"/>
-                        </pic:cNvPicPr>
-                      </pic:nvPicPr>
-                      <pic:blipFill>
-                        <a:blip r:embed="rId16"/>
-                        <a:stretch/>
-                      </pic:blipFill>
-                      <pic:spPr bwMode="auto">
-                        <a:xfrm>
-                          <a:off x="0" y="0"/>
-                          <a:ext cx="1159214" cy="632782"/>
-                        </a:xfrm>
-                        <a:prstGeom prst="rect">
-                          <a:avLst/>
-                        </a:prstGeom>
-                      </pic:spPr>
-                    </pic:pic>
-                  </a:graphicData>
-                </a:graphic>
-              </wp:inline>
-            </w:drawing>
-          </mc:Choice>
-          <mc:Fallback xmlns:a="http://schemas.openxmlformats.org/drawingml/2006/main">
-            <w:pict>
-              <v:shapetype type="#_x0000_t75" o:spt="75" coordsize="21600,21600" o:preferrelative="t" path="m@4@5l@4@11@9@11@9@5xe">
-                <v:formulas>
-                  <v:f eqn="if lineDrawn pixelLineWidth 0"/>
-                  <v:f eqn="sum @0 1 0"/>
-                  <v:f eqn="sum 0 0 @1"/>
-                  <v:f eqn="prod @2 1 2"/>
-                  <v:f eqn="prod @3 21600 pixelWidth"/>
-                  <v:f eqn="prod @3 21600 pixelHeight"/>
-                  <v:f eqn="sum @0 0 1"/>
-                  <v:f eqn="prod @6 1 2"/>
-                  <v:f eqn="prod @7 21600 pixelWidth"/>
-                  <v:f eqn="sum @8 21600 0"/>
-                  <v:f eqn="prod @7 21600 pixelHeight"/>
-                  <v:f eqn="sum @10 21600 0"/>
-                </v:formulas>
-              </v:shapetype>
-              <v:shape id="_x0000_i4" o:spid="_x0000_s4" type="#_x0000_t75" style="width:91.28pt;height:49.83pt;mso-wrap-distance-left:0.00pt;mso-wrap-distance-top:0.00pt;mso-wrap-distance-right:0.00pt;mso-wrap-distance-bottom:0.00pt;" stroked="false">
-                <v:path textboxrect="0,0,0,0"/>
-                <v:imagedata r:id="rId17" o:title=""/>
-              </v:shape>
-            </w:pict>
-          </mc:Fallback>
-        </mc:AlternateContent>
       </w:r>
     </w:p>
     <w:p>
@@ -1763,7 +1511,6 @@
         <w:rPr>
           <w:lang w:val="en-US"/>
         </w:rPr>
-        <w:lastRenderedPageBreak/>
         <w:t xml:space="preserve">select gender, count(attrition) as </w:t>
       </w:r>
       <w:proofErr w:type="spellStart"/>
@@ -1841,69 +1588,6 @@
         <w:rPr>
           <w:noProof/>
         </w:rPr>
-        <mc:AlternateContent>
-          <mc:Choice Requires="wpg">
-            <w:drawing>
-              <wp:inline distT="0" distB="0" distL="0" distR="0" wp14:anchorId="16BAC2F8" wp14:editId="15D65CAB">
-                <wp:extent cx="2435565" cy="730669"/>
-                <wp:effectExtent l="0" t="0" r="0" b="0"/>
-                <wp:docPr id="6" name="Picture 6"/>
-                <wp:cNvGraphicFramePr>
-                  <a:graphicFrameLocks xmlns:a="http://schemas.openxmlformats.org/drawingml/2006/main" noChangeAspect="1"/>
-                </wp:cNvGraphicFramePr>
-                <a:graphic xmlns:a="http://schemas.openxmlformats.org/drawingml/2006/main">
-                  <a:graphicData uri="http://schemas.openxmlformats.org/drawingml/2006/picture">
-                    <pic:pic xmlns:pic="http://schemas.openxmlformats.org/drawingml/2006/picture">
-                      <pic:nvPicPr>
-                        <pic:cNvPr id="1718927102" name=""/>
-                        <pic:cNvPicPr>
-                          <a:picLocks noChangeAspect="1"/>
-                        </pic:cNvPicPr>
-                      </pic:nvPicPr>
-                      <pic:blipFill>
-                        <a:blip r:embed="rId18"/>
-                        <a:stretch/>
-                      </pic:blipFill>
-                      <pic:spPr bwMode="auto">
-                        <a:xfrm>
-                          <a:off x="0" y="0"/>
-                          <a:ext cx="2435564" cy="730669"/>
-                        </a:xfrm>
-                        <a:prstGeom prst="rect">
-                          <a:avLst/>
-                        </a:prstGeom>
-                      </pic:spPr>
-                    </pic:pic>
-                  </a:graphicData>
-                </a:graphic>
-              </wp:inline>
-            </w:drawing>
-          </mc:Choice>
-          <mc:Fallback xmlns:a="http://schemas.openxmlformats.org/drawingml/2006/main">
-            <w:pict>
-              <v:shapetype type="#_x0000_t75" o:spt="75" coordsize="21600,21600" o:preferrelative="t" path="m@4@5l@4@11@9@11@9@5xe">
-                <v:formulas>
-                  <v:f eqn="if lineDrawn pixelLineWidth 0"/>
-                  <v:f eqn="sum @0 1 0"/>
-                  <v:f eqn="sum 0 0 @1"/>
-                  <v:f eqn="prod @2 1 2"/>
-                  <v:f eqn="prod @3 21600 pixelWidth"/>
-                  <v:f eqn="prod @3 21600 pixelHeight"/>
-                  <v:f eqn="sum @0 0 1"/>
-                  <v:f eqn="prod @6 1 2"/>
-                  <v:f eqn="prod @7 21600 pixelWidth"/>
-                  <v:f eqn="sum @8 21600 0"/>
-                  <v:f eqn="prod @7 21600 pixelHeight"/>
-                  <v:f eqn="sum @10 21600 0"/>
-                </v:formulas>
-              </v:shapetype>
-              <v:shape id="_x0000_i5" o:spid="_x0000_s5" type="#_x0000_t75" style="width:191.78pt;height:57.53pt;mso-wrap-distance-left:0.00pt;mso-wrap-distance-top:0.00pt;mso-wrap-distance-right:0.00pt;mso-wrap-distance-bottom:0.00pt;" stroked="false">
-                <v:path textboxrect="0,0,0,0"/>
-                <v:imagedata r:id="rId19" o:title=""/>
-              </v:shape>
-            </w:pict>
-          </mc:Fallback>
-        </mc:AlternateContent>
       </w:r>
     </w:p>
     <w:p>
@@ -2094,69 +1778,6 @@
         <w:rPr>
           <w:noProof/>
         </w:rPr>
-        <mc:AlternateContent>
-          <mc:Choice Requires="wpg">
-            <w:drawing>
-              <wp:inline distT="0" distB="0" distL="0" distR="0" wp14:anchorId="5BADC4EA" wp14:editId="34683913">
-                <wp:extent cx="2435565" cy="815777"/>
-                <wp:effectExtent l="0" t="0" r="0" b="0"/>
-                <wp:docPr id="7" name="Picture 7"/>
-                <wp:cNvGraphicFramePr>
-                  <a:graphicFrameLocks xmlns:a="http://schemas.openxmlformats.org/drawingml/2006/main" noChangeAspect="1"/>
-                </wp:cNvGraphicFramePr>
-                <a:graphic xmlns:a="http://schemas.openxmlformats.org/drawingml/2006/main">
-                  <a:graphicData uri="http://schemas.openxmlformats.org/drawingml/2006/picture">
-                    <pic:pic xmlns:pic="http://schemas.openxmlformats.org/drawingml/2006/picture">
-                      <pic:nvPicPr>
-                        <pic:cNvPr id="371935124" name=""/>
-                        <pic:cNvPicPr>
-                          <a:picLocks noChangeAspect="1"/>
-                        </pic:cNvPicPr>
-                      </pic:nvPicPr>
-                      <pic:blipFill>
-                        <a:blip r:embed="rId20"/>
-                        <a:stretch/>
-                      </pic:blipFill>
-                      <pic:spPr bwMode="auto">
-                        <a:xfrm>
-                          <a:off x="0" y="0"/>
-                          <a:ext cx="2435564" cy="815776"/>
-                        </a:xfrm>
-                        <a:prstGeom prst="rect">
-                          <a:avLst/>
-                        </a:prstGeom>
-                      </pic:spPr>
-                    </pic:pic>
-                  </a:graphicData>
-                </a:graphic>
-              </wp:inline>
-            </w:drawing>
-          </mc:Choice>
-          <mc:Fallback xmlns:a="http://schemas.openxmlformats.org/drawingml/2006/main">
-            <w:pict>
-              <v:shapetype type="#_x0000_t75" o:spt="75" coordsize="21600,21600" o:preferrelative="t" path="m@4@5l@4@11@9@11@9@5xe">
-                <v:formulas>
-                  <v:f eqn="if lineDrawn pixelLineWidth 0"/>
-                  <v:f eqn="sum @0 1 0"/>
-                  <v:f eqn="sum 0 0 @1"/>
-                  <v:f eqn="prod @2 1 2"/>
-                  <v:f eqn="prod @3 21600 pixelWidth"/>
-                  <v:f eqn="prod @3 21600 pixelHeight"/>
-                  <v:f eqn="sum @0 0 1"/>
-                  <v:f eqn="prod @6 1 2"/>
-                  <v:f eqn="prod @7 21600 pixelWidth"/>
-                  <v:f eqn="sum @8 21600 0"/>
-                  <v:f eqn="prod @7 21600 pixelHeight"/>
-                  <v:f eqn="sum @10 21600 0"/>
-                </v:formulas>
-              </v:shapetype>
-              <v:shape id="_x0000_i6" o:spid="_x0000_s6" type="#_x0000_t75" style="width:191.78pt;height:64.23pt;mso-wrap-distance-left:0.00pt;mso-wrap-distance-top:0.00pt;mso-wrap-distance-right:0.00pt;mso-wrap-distance-bottom:0.00pt;" stroked="false">
-                <v:path textboxrect="0,0,0,0"/>
-                <v:imagedata r:id="rId21" o:title=""/>
-              </v:shape>
-            </w:pict>
-          </mc:Fallback>
-        </mc:AlternateContent>
       </w:r>
     </w:p>
     <w:p>
@@ -2383,69 +2004,6 @@
         <w:rPr>
           <w:noProof/>
         </w:rPr>
-        <mc:AlternateContent>
-          <mc:Choice Requires="wpg">
-            <w:drawing>
-              <wp:inline distT="0" distB="0" distL="0" distR="0" wp14:anchorId="1D624F3E" wp14:editId="5F86BFFC">
-                <wp:extent cx="1217782" cy="1676900"/>
-                <wp:effectExtent l="0" t="0" r="0" b="0"/>
-                <wp:docPr id="8" name="Picture 8"/>
-                <wp:cNvGraphicFramePr>
-                  <a:graphicFrameLocks xmlns:a="http://schemas.openxmlformats.org/drawingml/2006/main" noChangeAspect="1"/>
-                </wp:cNvGraphicFramePr>
-                <a:graphic xmlns:a="http://schemas.openxmlformats.org/drawingml/2006/main">
-                  <a:graphicData uri="http://schemas.openxmlformats.org/drawingml/2006/picture">
-                    <pic:pic xmlns:pic="http://schemas.openxmlformats.org/drawingml/2006/picture">
-                      <pic:nvPicPr>
-                        <pic:cNvPr id="2050803284" name=""/>
-                        <pic:cNvPicPr>
-                          <a:picLocks noChangeAspect="1"/>
-                        </pic:cNvPicPr>
-                      </pic:nvPicPr>
-                      <pic:blipFill>
-                        <a:blip r:embed="rId22"/>
-                        <a:stretch/>
-                      </pic:blipFill>
-                      <pic:spPr bwMode="auto">
-                        <a:xfrm>
-                          <a:off x="0" y="0"/>
-                          <a:ext cx="1217782" cy="1676900"/>
-                        </a:xfrm>
-                        <a:prstGeom prst="rect">
-                          <a:avLst/>
-                        </a:prstGeom>
-                      </pic:spPr>
-                    </pic:pic>
-                  </a:graphicData>
-                </a:graphic>
-              </wp:inline>
-            </w:drawing>
-          </mc:Choice>
-          <mc:Fallback xmlns:a="http://schemas.openxmlformats.org/drawingml/2006/main">
-            <w:pict>
-              <v:shapetype type="#_x0000_t75" o:spt="75" coordsize="21600,21600" o:preferrelative="t" path="m@4@5l@4@11@9@11@9@5xe">
-                <v:formulas>
-                  <v:f eqn="if lineDrawn pixelLineWidth 0"/>
-                  <v:f eqn="sum @0 1 0"/>
-                  <v:f eqn="sum 0 0 @1"/>
-                  <v:f eqn="prod @2 1 2"/>
-                  <v:f eqn="prod @3 21600 pixelWidth"/>
-                  <v:f eqn="prod @3 21600 pixelHeight"/>
-                  <v:f eqn="sum @0 0 1"/>
-                  <v:f eqn="prod @6 1 2"/>
-                  <v:f eqn="prod @7 21600 pixelWidth"/>
-                  <v:f eqn="sum @8 21600 0"/>
-                  <v:f eqn="prod @7 21600 pixelHeight"/>
-                  <v:f eqn="sum @10 21600 0"/>
-                </v:formulas>
-              </v:shapetype>
-              <v:shape id="_x0000_i7" o:spid="_x0000_s7" type="#_x0000_t75" style="width:95.89pt;height:132.04pt;mso-wrap-distance-left:0.00pt;mso-wrap-distance-top:0.00pt;mso-wrap-distance-right:0.00pt;mso-wrap-distance-bottom:0.00pt;" stroked="false">
-                <v:path textboxrect="0,0,0,0"/>
-                <v:imagedata r:id="rId23" o:title=""/>
-              </v:shape>
-            </w:pict>
-          </mc:Fallback>
-        </mc:AlternateContent>
       </w:r>
     </w:p>
     <w:p>
@@ -2521,7 +2079,6 @@
         <w:rPr>
           <w:lang w:val="en-US"/>
         </w:rPr>
-        <w:lastRenderedPageBreak/>
         <w:t xml:space="preserve">select </w:t>
       </w:r>
       <w:proofErr w:type="spellStart"/>
@@ -2627,69 +2184,6 @@
         <w:rPr>
           <w:noProof/>
         </w:rPr>
-        <mc:AlternateContent>
-          <mc:Choice Requires="wpg">
-            <w:drawing>
-              <wp:inline distT="0" distB="0" distL="0" distR="0" wp14:anchorId="4F8004CE" wp14:editId="7D454001">
-                <wp:extent cx="2445090" cy="1533284"/>
-                <wp:effectExtent l="0" t="0" r="0" b="0"/>
-                <wp:docPr id="9" name="Picture 9"/>
-                <wp:cNvGraphicFramePr>
-                  <a:graphicFrameLocks xmlns:a="http://schemas.openxmlformats.org/drawingml/2006/main" noChangeAspect="1"/>
-                </wp:cNvGraphicFramePr>
-                <a:graphic xmlns:a="http://schemas.openxmlformats.org/drawingml/2006/main">
-                  <a:graphicData uri="http://schemas.openxmlformats.org/drawingml/2006/picture">
-                    <pic:pic xmlns:pic="http://schemas.openxmlformats.org/drawingml/2006/picture">
-                      <pic:nvPicPr>
-                        <pic:cNvPr id="369799642" name=""/>
-                        <pic:cNvPicPr>
-                          <a:picLocks noChangeAspect="1"/>
-                        </pic:cNvPicPr>
-                      </pic:nvPicPr>
-                      <pic:blipFill>
-                        <a:blip r:embed="rId24"/>
-                        <a:stretch/>
-                      </pic:blipFill>
-                      <pic:spPr bwMode="auto">
-                        <a:xfrm>
-                          <a:off x="0" y="0"/>
-                          <a:ext cx="2445089" cy="1533284"/>
-                        </a:xfrm>
-                        <a:prstGeom prst="rect">
-                          <a:avLst/>
-                        </a:prstGeom>
-                      </pic:spPr>
-                    </pic:pic>
-                  </a:graphicData>
-                </a:graphic>
-              </wp:inline>
-            </w:drawing>
-          </mc:Choice>
-          <mc:Fallback xmlns:a="http://schemas.openxmlformats.org/drawingml/2006/main">
-            <w:pict>
-              <v:shapetype type="#_x0000_t75" o:spt="75" coordsize="21600,21600" o:preferrelative="t" path="m@4@5l@4@11@9@11@9@5xe">
-                <v:formulas>
-                  <v:f eqn="if lineDrawn pixelLineWidth 0"/>
-                  <v:f eqn="sum @0 1 0"/>
-                  <v:f eqn="sum 0 0 @1"/>
-                  <v:f eqn="prod @2 1 2"/>
-                  <v:f eqn="prod @3 21600 pixelWidth"/>
-                  <v:f eqn="prod @3 21600 pixelHeight"/>
-                  <v:f eqn="sum @0 0 1"/>
-                  <v:f eqn="prod @6 1 2"/>
-                  <v:f eqn="prod @7 21600 pixelWidth"/>
-                  <v:f eqn="sum @8 21600 0"/>
-                  <v:f eqn="prod @7 21600 pixelHeight"/>
-                  <v:f eqn="sum @10 21600 0"/>
-                </v:formulas>
-              </v:shapetype>
-              <v:shape id="_x0000_i8" o:spid="_x0000_s8" type="#_x0000_t75" style="width:192.53pt;height:120.73pt;mso-wrap-distance-left:0.00pt;mso-wrap-distance-top:0.00pt;mso-wrap-distance-right:0.00pt;mso-wrap-distance-bottom:0.00pt;" stroked="false">
-                <v:path textboxrect="0,0,0,0"/>
-                <v:imagedata r:id="rId25" o:title=""/>
-              </v:shape>
-            </w:pict>
-          </mc:Fallback>
-        </mc:AlternateContent>
       </w:r>
     </w:p>
     <w:p>
@@ -2934,69 +2428,6 @@
         <w:rPr>
           <w:noProof/>
         </w:rPr>
-        <mc:AlternateContent>
-          <mc:Choice Requires="wpg">
-            <w:drawing>
-              <wp:inline distT="0" distB="0" distL="0" distR="0" wp14:anchorId="64B55927" wp14:editId="1C2A1180">
-                <wp:extent cx="2970404" cy="1670643"/>
-                <wp:effectExtent l="0" t="0" r="0" b="0"/>
-                <wp:docPr id="10" name="Picture 10"/>
-                <wp:cNvGraphicFramePr>
-                  <a:graphicFrameLocks xmlns:a="http://schemas.openxmlformats.org/drawingml/2006/main" noChangeAspect="1"/>
-                </wp:cNvGraphicFramePr>
-                <a:graphic xmlns:a="http://schemas.openxmlformats.org/drawingml/2006/main">
-                  <a:graphicData uri="http://schemas.openxmlformats.org/drawingml/2006/picture">
-                    <pic:pic xmlns:pic="http://schemas.openxmlformats.org/drawingml/2006/picture">
-                      <pic:nvPicPr>
-                        <pic:cNvPr id="46992325" name=""/>
-                        <pic:cNvPicPr>
-                          <a:picLocks noChangeAspect="1"/>
-                        </pic:cNvPicPr>
-                      </pic:nvPicPr>
-                      <pic:blipFill>
-                        <a:blip r:embed="rId26"/>
-                        <a:stretch/>
-                      </pic:blipFill>
-                      <pic:spPr bwMode="auto">
-                        <a:xfrm>
-                          <a:off x="0" y="0"/>
-                          <a:ext cx="2970403" cy="1670643"/>
-                        </a:xfrm>
-                        <a:prstGeom prst="rect">
-                          <a:avLst/>
-                        </a:prstGeom>
-                      </pic:spPr>
-                    </pic:pic>
-                  </a:graphicData>
-                </a:graphic>
-              </wp:inline>
-            </w:drawing>
-          </mc:Choice>
-          <mc:Fallback xmlns:a="http://schemas.openxmlformats.org/drawingml/2006/main">
-            <w:pict>
-              <v:shapetype type="#_x0000_t75" o:spt="75" coordsize="21600,21600" o:preferrelative="t" path="m@4@5l@4@11@9@11@9@5xe">
-                <v:formulas>
-                  <v:f eqn="if lineDrawn pixelLineWidth 0"/>
-                  <v:f eqn="sum @0 1 0"/>
-                  <v:f eqn="sum 0 0 @1"/>
-                  <v:f eqn="prod @2 1 2"/>
-                  <v:f eqn="prod @3 21600 pixelWidth"/>
-                  <v:f eqn="prod @3 21600 pixelHeight"/>
-                  <v:f eqn="sum @0 0 1"/>
-                  <v:f eqn="prod @6 1 2"/>
-                  <v:f eqn="prod @7 21600 pixelWidth"/>
-                  <v:f eqn="sum @8 21600 0"/>
-                  <v:f eqn="prod @7 21600 pixelHeight"/>
-                  <v:f eqn="sum @10 21600 0"/>
-                </v:formulas>
-              </v:shapetype>
-              <v:shape id="_x0000_i9" o:spid="_x0000_s9" type="#_x0000_t75" style="width:233.89pt;height:131.55pt;mso-wrap-distance-left:0.00pt;mso-wrap-distance-top:0.00pt;mso-wrap-distance-right:0.00pt;mso-wrap-distance-bottom:0.00pt;" stroked="false">
-                <v:path textboxrect="0,0,0,0"/>
-                <v:imagedata r:id="rId27" o:title=""/>
-              </v:shape>
-            </w:pict>
-          </mc:Fallback>
-        </mc:AlternateContent>
       </w:r>
     </w:p>
     <w:p>
@@ -3315,7 +2746,6 @@
         <w:rPr>
           <w:lang w:val="en-US"/>
         </w:rPr>
-        <w:lastRenderedPageBreak/>
         <w:t xml:space="preserve">   </w:t>
       </w:r>
       <w:r>
@@ -3553,69 +2983,6 @@
         <w:rPr>
           <w:noProof/>
         </w:rPr>
-        <mc:AlternateContent>
-          <mc:Choice Requires="wpg">
-            <w:drawing>
-              <wp:inline distT="0" distB="0" distL="0" distR="0" wp14:anchorId="14EE174C" wp14:editId="0D007024">
-                <wp:extent cx="3691292" cy="1843663"/>
-                <wp:effectExtent l="0" t="0" r="0" b="0"/>
-                <wp:docPr id="11" name="Picture 11"/>
-                <wp:cNvGraphicFramePr>
-                  <a:graphicFrameLocks xmlns:a="http://schemas.openxmlformats.org/drawingml/2006/main" noChangeAspect="1"/>
-                </wp:cNvGraphicFramePr>
-                <a:graphic xmlns:a="http://schemas.openxmlformats.org/drawingml/2006/main">
-                  <a:graphicData uri="http://schemas.openxmlformats.org/drawingml/2006/picture">
-                    <pic:pic xmlns:pic="http://schemas.openxmlformats.org/drawingml/2006/picture">
-                      <pic:nvPicPr>
-                        <pic:cNvPr id="734372026" name=""/>
-                        <pic:cNvPicPr>
-                          <a:picLocks noChangeAspect="1"/>
-                        </pic:cNvPicPr>
-                      </pic:nvPicPr>
-                      <pic:blipFill>
-                        <a:blip r:embed="rId28"/>
-                        <a:stretch/>
-                      </pic:blipFill>
-                      <pic:spPr bwMode="auto">
-                        <a:xfrm>
-                          <a:off x="0" y="0"/>
-                          <a:ext cx="3691292" cy="1843663"/>
-                        </a:xfrm>
-                        <a:prstGeom prst="rect">
-                          <a:avLst/>
-                        </a:prstGeom>
-                      </pic:spPr>
-                    </pic:pic>
-                  </a:graphicData>
-                </a:graphic>
-              </wp:inline>
-            </w:drawing>
-          </mc:Choice>
-          <mc:Fallback xmlns:a="http://schemas.openxmlformats.org/drawingml/2006/main">
-            <w:pict>
-              <v:shapetype type="#_x0000_t75" o:spt="75" coordsize="21600,21600" o:preferrelative="t" path="m@4@5l@4@11@9@11@9@5xe">
-                <v:formulas>
-                  <v:f eqn="if lineDrawn pixelLineWidth 0"/>
-                  <v:f eqn="sum @0 1 0"/>
-                  <v:f eqn="sum 0 0 @1"/>
-                  <v:f eqn="prod @2 1 2"/>
-                  <v:f eqn="prod @3 21600 pixelWidth"/>
-                  <v:f eqn="prod @3 21600 pixelHeight"/>
-                  <v:f eqn="sum @0 0 1"/>
-                  <v:f eqn="prod @6 1 2"/>
-                  <v:f eqn="prod @7 21600 pixelWidth"/>
-                  <v:f eqn="sum @8 21600 0"/>
-                  <v:f eqn="prod @7 21600 pixelHeight"/>
-                  <v:f eqn="sum @10 21600 0"/>
-                </v:formulas>
-              </v:shapetype>
-              <v:shape id="_x0000_i10" o:spid="_x0000_s10" type="#_x0000_t75" style="width:290.65pt;height:145.17pt;mso-wrap-distance-left:0.00pt;mso-wrap-distance-top:0.00pt;mso-wrap-distance-right:0.00pt;mso-wrap-distance-bottom:0.00pt;" stroked="false">
-                <v:path textboxrect="0,0,0,0"/>
-                <v:imagedata r:id="rId29" o:title=""/>
-              </v:shape>
-            </w:pict>
-          </mc:Fallback>
-        </mc:AlternateContent>
       </w:r>
     </w:p>
     <w:p/>

</xml_diff>